<commit_message>
modificacion en pdf para extenciones de vscode
</commit_message>
<xml_diff>
--- a/Proyecto NUeva Vida .docx
+++ b/Proyecto NUeva Vida .docx
@@ -937,7 +937,7 @@
           <w:noProof/>
         </w:rPr>
         <w:drawing>
-          <wp:anchor distT="0" distB="0" distL="114300" distR="114300" simplePos="0" relativeHeight="251658240" behindDoc="1" locked="0" layoutInCell="1" allowOverlap="1" wp14:anchorId="60EB89B5" wp14:editId="23ED79F2">
+          <wp:anchor distT="0" distB="0" distL="114300" distR="114300" simplePos="0" relativeHeight="251658240" behindDoc="1" locked="0" layoutInCell="1" allowOverlap="1" wp14:anchorId="60EB89B5" wp14:editId="21F15A90">
             <wp:simplePos x="0" y="0"/>
             <wp:positionH relativeFrom="margin">
               <wp:align>right</wp:align>
@@ -14068,6 +14068,7 @@
       <w:r>
         <w:rPr>
           <w:rFonts w:ascii="Times New Roman" w:hAnsi="Times New Roman" w:cs="Times New Roman"/>
+          <w:noProof/>
           <w:sz w:val="24"/>
           <w:szCs w:val="24"/>
         </w:rPr>
@@ -14297,6 +14298,7 @@
       <w:r>
         <w:rPr>
           <w:rFonts w:ascii="Times New Roman" w:hAnsi="Times New Roman" w:cs="Times New Roman"/>
+          <w:noProof/>
           <w:sz w:val="24"/>
           <w:szCs w:val="24"/>
         </w:rPr>
@@ -14411,6 +14413,7 @@
       <w:r>
         <w:rPr>
           <w:rFonts w:ascii="Times New Roman" w:hAnsi="Times New Roman" w:cs="Times New Roman"/>
+          <w:noProof/>
           <w:sz w:val="24"/>
           <w:szCs w:val="24"/>
         </w:rPr>
@@ -14542,7 +14545,25 @@
           <w:sz w:val="24"/>
           <w:szCs w:val="24"/>
         </w:rPr>
-        <w:t xml:space="preserve">Cabe destacar que no es necesario terminar con un “;” (punto y coma) en la ultima propiedad del </w:t>
+        <w:t xml:space="preserve">Cabe destacar que no es necesario terminar con un “;” (punto y coma) en la </w:t>
+      </w:r>
+      <w:proofErr w:type="spellStart"/>
+      <w:r>
+        <w:rPr>
+          <w:rFonts w:ascii="Times New Roman" w:hAnsi="Times New Roman" w:cs="Times New Roman"/>
+          <w:sz w:val="24"/>
+          <w:szCs w:val="24"/>
+        </w:rPr>
+        <w:t>ultima</w:t>
+      </w:r>
+      <w:proofErr w:type="spellEnd"/>
+      <w:r>
+        <w:rPr>
+          <w:rFonts w:ascii="Times New Roman" w:hAnsi="Times New Roman" w:cs="Times New Roman"/>
+          <w:sz w:val="24"/>
+          <w:szCs w:val="24"/>
+        </w:rPr>
+        <w:t xml:space="preserve"> propiedad del </w:t>
       </w:r>
       <w:proofErr w:type="spellStart"/>
       <w:r>
@@ -14671,6 +14692,7 @@
       <w:r>
         <w:rPr>
           <w:rFonts w:ascii="Times New Roman" w:hAnsi="Times New Roman" w:cs="Times New Roman"/>
+          <w:noProof/>
           <w:sz w:val="24"/>
           <w:szCs w:val="24"/>
         </w:rPr>
@@ -14933,6 +14955,7 @@
       <w:r>
         <w:rPr>
           <w:rFonts w:ascii="Times New Roman" w:hAnsi="Times New Roman" w:cs="Times New Roman"/>
+          <w:noProof/>
           <w:sz w:val="24"/>
           <w:szCs w:val="24"/>
         </w:rPr>
@@ -15141,6 +15164,7 @@
       <w:r>
         <w:rPr>
           <w:rFonts w:ascii="Times New Roman" w:hAnsi="Times New Roman" w:cs="Times New Roman"/>
+          <w:noProof/>
           <w:sz w:val="24"/>
           <w:szCs w:val="24"/>
         </w:rPr>
@@ -15268,6 +15292,7 @@
       <w:r>
         <w:rPr>
           <w:rFonts w:ascii="Times New Roman" w:hAnsi="Times New Roman" w:cs="Times New Roman"/>
+          <w:noProof/>
           <w:sz w:val="24"/>
           <w:szCs w:val="24"/>
         </w:rPr>
@@ -15385,6 +15410,7 @@
       <w:r>
         <w:rPr>
           <w:rFonts w:ascii="Times New Roman" w:hAnsi="Times New Roman" w:cs="Times New Roman"/>
+          <w:noProof/>
           <w:sz w:val="24"/>
           <w:szCs w:val="24"/>
         </w:rPr>
@@ -15633,6 +15659,7 @@
       <w:r>
         <w:rPr>
           <w:rFonts w:ascii="Times New Roman" w:hAnsi="Times New Roman" w:cs="Times New Roman"/>
+          <w:noProof/>
           <w:sz w:val="24"/>
           <w:szCs w:val="24"/>
           <w:u w:val="single"/>
@@ -15845,7 +15872,25 @@
           <w:sz w:val="24"/>
           <w:szCs w:val="24"/>
         </w:rPr>
-        <w:t xml:space="preserve"> esta por debajo de lo que yo le puse cuando cree esta tipografía al ver en el navegador no veremos diferencia de tamaño, solo veremos la diferencia de tamaño al pasar por encima del </w:t>
+        <w:t xml:space="preserve"> </w:t>
+      </w:r>
+      <w:proofErr w:type="spellStart"/>
+      <w:r>
+        <w:rPr>
+          <w:rFonts w:ascii="Times New Roman" w:hAnsi="Times New Roman" w:cs="Times New Roman"/>
+          <w:sz w:val="24"/>
+          <w:szCs w:val="24"/>
+        </w:rPr>
+        <w:t>esta</w:t>
+      </w:r>
+      <w:proofErr w:type="spellEnd"/>
+      <w:r>
+        <w:rPr>
+          <w:rFonts w:ascii="Times New Roman" w:hAnsi="Times New Roman" w:cs="Times New Roman"/>
+          <w:sz w:val="24"/>
+          <w:szCs w:val="24"/>
+        </w:rPr>
+        <w:t xml:space="preserve"> por debajo de lo que yo le puse cuando cree esta tipografía al ver en el navegador no veremos diferencia de tamaño, solo veremos la diferencia de tamaño al pasar por encima del </w:t>
       </w:r>
       <w:proofErr w:type="spellStart"/>
       <w:r>
@@ -15879,6 +15924,7 @@
       <w:r>
         <w:rPr>
           <w:rFonts w:ascii="Times New Roman" w:hAnsi="Times New Roman" w:cs="Times New Roman"/>
+          <w:noProof/>
           <w:sz w:val="24"/>
           <w:szCs w:val="24"/>
         </w:rPr>
@@ -15993,6 +16039,7 @@
       <w:r>
         <w:rPr>
           <w:rFonts w:ascii="Times New Roman" w:hAnsi="Times New Roman" w:cs="Times New Roman"/>
+          <w:noProof/>
           <w:sz w:val="24"/>
           <w:szCs w:val="24"/>
         </w:rPr>
@@ -16107,6 +16154,7 @@
       <w:r>
         <w:rPr>
           <w:rFonts w:ascii="Times New Roman" w:hAnsi="Times New Roman" w:cs="Times New Roman"/>
+          <w:noProof/>
           <w:sz w:val="24"/>
           <w:szCs w:val="24"/>
         </w:rPr>
@@ -16290,6 +16338,7 @@
       <w:r>
         <w:rPr>
           <w:rFonts w:ascii="Times New Roman" w:hAnsi="Times New Roman" w:cs="Times New Roman"/>
+          <w:noProof/>
           <w:sz w:val="24"/>
           <w:szCs w:val="24"/>
         </w:rPr>
@@ -16693,6 +16742,260 @@
         <w:t>jajajaj</w:t>
       </w:r>
       <w:proofErr w:type="spellEnd"/>
+    </w:p>
+    <w:p>
+      <w:pPr>
+        <w:ind w:left="360"/>
+        <w:jc w:val="both"/>
+        <w:rPr>
+          <w:rFonts w:ascii="Times New Roman" w:hAnsi="Times New Roman" w:cs="Times New Roman"/>
+          <w:sz w:val="24"/>
+          <w:szCs w:val="24"/>
+        </w:rPr>
+      </w:pPr>
+    </w:p>
+    <w:p>
+      <w:pPr>
+        <w:ind w:left="360"/>
+        <w:jc w:val="both"/>
+        <w:rPr>
+          <w:rFonts w:ascii="Times New Roman" w:hAnsi="Times New Roman" w:cs="Times New Roman"/>
+          <w:sz w:val="24"/>
+          <w:szCs w:val="24"/>
+        </w:rPr>
+      </w:pPr>
+    </w:p>
+    <w:p>
+      <w:pPr>
+        <w:ind w:left="360"/>
+        <w:jc w:val="both"/>
+        <w:rPr>
+          <w:rFonts w:ascii="Times New Roman" w:hAnsi="Times New Roman" w:cs="Times New Roman"/>
+          <w:sz w:val="24"/>
+          <w:szCs w:val="24"/>
+        </w:rPr>
+      </w:pPr>
+    </w:p>
+    <w:p>
+      <w:pPr>
+        <w:ind w:left="360"/>
+        <w:jc w:val="both"/>
+        <w:rPr>
+          <w:rFonts w:ascii="Times New Roman" w:hAnsi="Times New Roman" w:cs="Times New Roman"/>
+          <w:sz w:val="24"/>
+          <w:szCs w:val="24"/>
+        </w:rPr>
+      </w:pPr>
+    </w:p>
+    <w:p>
+      <w:pPr>
+        <w:ind w:left="360"/>
+        <w:jc w:val="both"/>
+        <w:rPr>
+          <w:rFonts w:ascii="Times New Roman" w:hAnsi="Times New Roman" w:cs="Times New Roman"/>
+          <w:sz w:val="24"/>
+          <w:szCs w:val="24"/>
+        </w:rPr>
+      </w:pPr>
+    </w:p>
+    <w:p>
+      <w:pPr>
+        <w:ind w:left="360"/>
+        <w:jc w:val="both"/>
+        <w:rPr>
+          <w:rFonts w:ascii="Times New Roman" w:hAnsi="Times New Roman" w:cs="Times New Roman"/>
+          <w:sz w:val="24"/>
+          <w:szCs w:val="24"/>
+        </w:rPr>
+      </w:pPr>
+    </w:p>
+    <w:p>
+      <w:pPr>
+        <w:ind w:left="360"/>
+        <w:jc w:val="both"/>
+        <w:rPr>
+          <w:rFonts w:ascii="Times New Roman" w:hAnsi="Times New Roman" w:cs="Times New Roman"/>
+          <w:sz w:val="24"/>
+          <w:szCs w:val="24"/>
+        </w:rPr>
+      </w:pPr>
+    </w:p>
+    <w:p>
+      <w:pPr>
+        <w:ind w:left="360"/>
+        <w:jc w:val="both"/>
+        <w:rPr>
+          <w:rFonts w:ascii="Times New Roman" w:hAnsi="Times New Roman" w:cs="Times New Roman"/>
+          <w:sz w:val="24"/>
+          <w:szCs w:val="24"/>
+        </w:rPr>
+      </w:pPr>
+    </w:p>
+    <w:p>
+      <w:pPr>
+        <w:ind w:left="360"/>
+        <w:jc w:val="both"/>
+        <w:rPr>
+          <w:rFonts w:ascii="Times New Roman" w:hAnsi="Times New Roman" w:cs="Times New Roman"/>
+          <w:sz w:val="24"/>
+          <w:szCs w:val="24"/>
+        </w:rPr>
+      </w:pPr>
+    </w:p>
+    <w:p>
+      <w:pPr>
+        <w:ind w:left="360"/>
+        <w:jc w:val="both"/>
+        <w:rPr>
+          <w:rFonts w:ascii="Times New Roman" w:hAnsi="Times New Roman" w:cs="Times New Roman"/>
+          <w:sz w:val="24"/>
+          <w:szCs w:val="24"/>
+        </w:rPr>
+      </w:pPr>
+    </w:p>
+    <w:p>
+      <w:pPr>
+        <w:ind w:left="360"/>
+        <w:jc w:val="both"/>
+        <w:rPr>
+          <w:rFonts w:ascii="Times New Roman" w:hAnsi="Times New Roman" w:cs="Times New Roman"/>
+          <w:sz w:val="24"/>
+          <w:szCs w:val="24"/>
+        </w:rPr>
+      </w:pPr>
+    </w:p>
+    <w:p>
+      <w:pPr>
+        <w:ind w:left="360"/>
+        <w:jc w:val="both"/>
+        <w:rPr>
+          <w:rFonts w:ascii="Times New Roman" w:hAnsi="Times New Roman" w:cs="Times New Roman"/>
+          <w:sz w:val="24"/>
+          <w:szCs w:val="24"/>
+        </w:rPr>
+      </w:pPr>
+    </w:p>
+    <w:p>
+      <w:pPr>
+        <w:ind w:left="360"/>
+        <w:jc w:val="both"/>
+        <w:rPr>
+          <w:rFonts w:ascii="Times New Roman" w:hAnsi="Times New Roman" w:cs="Times New Roman"/>
+          <w:sz w:val="24"/>
+          <w:szCs w:val="24"/>
+        </w:rPr>
+      </w:pPr>
+    </w:p>
+    <w:p>
+      <w:pPr>
+        <w:ind w:left="360"/>
+        <w:jc w:val="both"/>
+        <w:rPr>
+          <w:rFonts w:ascii="Times New Roman" w:hAnsi="Times New Roman" w:cs="Times New Roman"/>
+          <w:sz w:val="24"/>
+          <w:szCs w:val="24"/>
+        </w:rPr>
+      </w:pPr>
+      <w:r>
+        <w:rPr>
+          <w:rFonts w:ascii="Times New Roman" w:hAnsi="Times New Roman" w:cs="Times New Roman"/>
+          <w:sz w:val="24"/>
+          <w:szCs w:val="24"/>
+        </w:rPr>
+        <w:lastRenderedPageBreak/>
+        <w:t xml:space="preserve">Extensiones instaladas en </w:t>
+      </w:r>
+      <w:proofErr w:type="spellStart"/>
+      <w:r>
+        <w:rPr>
+          <w:rFonts w:ascii="Times New Roman" w:hAnsi="Times New Roman" w:cs="Times New Roman"/>
+          <w:sz w:val="24"/>
+          <w:szCs w:val="24"/>
+        </w:rPr>
+        <w:t>vscode</w:t>
+      </w:r>
+      <w:proofErr w:type="spellEnd"/>
+      <w:r>
+        <w:rPr>
+          <w:rFonts w:ascii="Times New Roman" w:hAnsi="Times New Roman" w:cs="Times New Roman"/>
+          <w:sz w:val="24"/>
+          <w:szCs w:val="24"/>
+        </w:rPr>
+        <w:t>:</w:t>
+      </w:r>
+    </w:p>
+    <w:p>
+      <w:pPr>
+        <w:ind w:left="360"/>
+        <w:jc w:val="both"/>
+        <w:rPr>
+          <w:rFonts w:ascii="Times New Roman" w:hAnsi="Times New Roman" w:cs="Times New Roman"/>
+          <w:sz w:val="24"/>
+          <w:szCs w:val="24"/>
+        </w:rPr>
+      </w:pPr>
+      <w:r>
+        <w:rPr>
+          <w:rFonts w:ascii="Times New Roman" w:hAnsi="Times New Roman" w:cs="Times New Roman"/>
+          <w:sz w:val="24"/>
+          <w:szCs w:val="24"/>
+        </w:rPr>
+        <w:drawing>
+          <wp:anchor distT="0" distB="0" distL="114300" distR="114300" simplePos="0" relativeHeight="251715584" behindDoc="1" locked="0" layoutInCell="1" allowOverlap="1" wp14:anchorId="13F6ADBA" wp14:editId="69EC3C01">
+            <wp:simplePos x="0" y="0"/>
+            <wp:positionH relativeFrom="column">
+              <wp:posOffset>226151</wp:posOffset>
+            </wp:positionH>
+            <wp:positionV relativeFrom="paragraph">
+              <wp:posOffset>103786</wp:posOffset>
+            </wp:positionV>
+            <wp:extent cx="4441507" cy="8488194"/>
+            <wp:effectExtent l="0" t="0" r="0" b="8255"/>
+            <wp:wrapNone/>
+            <wp:docPr id="1376525396" name="Imagen 1"/>
+            <wp:cNvGraphicFramePr>
+              <a:graphicFrameLocks xmlns:a="http://schemas.openxmlformats.org/drawingml/2006/main" noChangeAspect="1"/>
+            </wp:cNvGraphicFramePr>
+            <a:graphic xmlns:a="http://schemas.openxmlformats.org/drawingml/2006/main">
+              <a:graphicData uri="http://schemas.openxmlformats.org/drawingml/2006/picture">
+                <pic:pic xmlns:pic="http://schemas.openxmlformats.org/drawingml/2006/picture">
+                  <pic:nvPicPr>
+                    <pic:cNvPr id="1376525396" name=""/>
+                    <pic:cNvPicPr/>
+                  </pic:nvPicPr>
+                  <pic:blipFill>
+                    <a:blip r:embed="rId48">
+                      <a:extLst>
+                        <a:ext uri="{28A0092B-C50C-407E-A947-70E740481C1C}">
+                          <a14:useLocalDpi xmlns:a14="http://schemas.microsoft.com/office/drawing/2010/main" val="0"/>
+                        </a:ext>
+                      </a:extLst>
+                    </a:blip>
+                    <a:stretch>
+                      <a:fillRect/>
+                    </a:stretch>
+                  </pic:blipFill>
+                  <pic:spPr>
+                    <a:xfrm>
+                      <a:off x="0" y="0"/>
+                      <a:ext cx="4443727" cy="8492437"/>
+                    </a:xfrm>
+                    <a:prstGeom prst="rect">
+                      <a:avLst/>
+                    </a:prstGeom>
+                  </pic:spPr>
+                </pic:pic>
+              </a:graphicData>
+            </a:graphic>
+            <wp14:sizeRelH relativeFrom="page">
+              <wp14:pctWidth>0</wp14:pctWidth>
+            </wp14:sizeRelH>
+            <wp14:sizeRelV relativeFrom="page">
+              <wp14:pctHeight>0</wp14:pctHeight>
+            </wp14:sizeRelV>
+          </wp:anchor>
+        </w:drawing>
+      </w:r>
     </w:p>
     <w:sectPr>
       <w:pgSz w:w="11906" w:h="16838"/>

</xml_diff>